<commit_message>
Fix a mislabelled cross-reference: 2.3 was never the issue
The user asked why Section 2.3 needed clarification - it doesn't.
2.3 is solid, page-cited content about the Advanced Level pathways.
The actual open verification item was a callout box placed right
after it, which I'd never given its own heading - I'd just cited it
as "Section 2.3" by physical proximity when cross-referencing it
from the cover page, Section 8, Section 9, and the facilitator's
guide. All four references were wrong.

Gave the callout its own heading (2.4 "What This Document Cannot
Confirm on Its Own") and corrected all four cross-references -
three in docs/syllabus-mapping.docx, one in
docs/facilitators-guide.docx - to point to 2.4 instead of 2.3.
Bumped the mapping document to v0.6 with this recorded in its own
version history.

Co-Authored-By: Claude Sonnet 5 <noreply@anthropic.com>
Claude-Session: https://claude.ai/code/session_01S1ZS8fjUnTRcrXfFvHxdTZ
</commit_message>
<xml_diff>
--- a/pathway-orientation/docs/facilitators-guide.docx
+++ b/pathway-orientation/docs/facilitators-guide.docx
@@ -423,7 +423,7 @@
                 <w:sz w:val="19"/>
                 <w:szCs w:val="19"/>
               </w:rPr>
-              <w:t xml:space="preserve">14 September 2026</w:t>
+              <w:t xml:space="preserve">15 September 2026</w:t>
             </w:r>
           </w:p>
         </w:tc>
@@ -464,7 +464,7 @@
           <w:sz w:val="21"/>
           <w:szCs w:val="21"/>
         </w:rPr>
-        <w:t xml:space="preserve">This guide has not yet been piloted in a real classroom. Read it fully before your first session, adapt the timings to your own periods, and — if possible — have a second Guidance teacher or school counsellor review it with you first. Please also read docs/syllabus-mapping.docx alongside this guide: it grounds the same four official Careers Guidance and Counselling areas — Personal, Social, Vocational, Educational (PSVE) — used throughout this document in the 2023 Zambia Education Curriculum Framework, and names one item still worth confirming with CDC (its Section 2.3).</w:t>
+        <w:t xml:space="preserve">This guide has not yet been piloted in a real classroom. Read it fully before your first session, adapt the timings to your own periods, and — if possible — have a second Guidance teacher or school counsellor review it with you first. Please also read docs/syllabus-mapping.docx alongside this guide: it grounds the same four official Careers Guidance and Counselling areas — Personal, Social, Vocational, Educational (PSVE) — used throughout this document in the 2023 Zambia Education Curriculum Framework, and names one item still worth confirming with CDC (its Section 2.4).</w:t>
       </w:r>
     </w:p>
     <w:p>

</xml_diff>

<commit_message>
Replace em/en-dash prose separators with proper punctuation
Across the workbook data, web app, PDF generator, and all four
CDC submission documents, mid-sentence em-dashes are now colons,
semicolons, commas, or parentheses depending on the grammatical
role they were playing. Structural "Name — Label" separators
(orientation names, document titles, session headings, part
dividers) now use a colon instead. Numeric ranges (1–5, pp.11–12)
are left as en-dashes since that is correct usage, not a stray
dash. The three docx/pdf submission documents and the merged
master package were rebuilt and reconverted to PDF, with the
master's two-pass page numbering re-verified against the new text.

Co-Authored-By: Claude Sonnet 5 <noreply@anthropic.com>
Claude-Session: https://claude.ai/code/session_01S1ZS8fjUnTRcrXfFvHxdTZ
</commit_message>
<xml_diff>
--- a/pathway-orientation/docs/facilitators-guide.docx
+++ b/pathway-orientation/docs/facilitators-guide.docx
@@ -31,7 +31,7 @@
           <w:sz w:val="22"/>
           <w:szCs w:val="22"/>
         </w:rPr>
-        <w:t xml:space="preserve">Pathway Orientation — for Guidance and Counselling teachers running the workbook with Form 3 and Form 4 learners</w:t>
+        <w:t xml:space="preserve">Pathway Orientation: for Guidance and Counselling teachers running the workbook with Form 3 and Form 4 learners</w:t>
       </w:r>
     </w:p>
     <w:tbl>
@@ -108,7 +108,7 @@
                 <w:sz w:val="19"/>
                 <w:szCs w:val="19"/>
               </w:rPr>
-              <w:t xml:space="preserve">Facilitator's Guide — Pathway Orientation</w:t>
+              <w:t xml:space="preserve">Facilitator's Guide: Pathway Orientation</w:t>
             </w:r>
           </w:p>
         </w:tc>
@@ -297,7 +297,7 @@
                 <w:sz w:val="19"/>
                 <w:szCs w:val="19"/>
               </w:rPr>
-              <w:t xml:space="preserve">DRAFT — has not yet been piloted in a real classroom; review before use (see Section 1)</w:t>
+              <w:t xml:space="preserve">DRAFT: has not yet been piloted in a real classroom; review before use (see Section 1)</w:t>
             </w:r>
           </w:p>
         </w:tc>
@@ -423,7 +423,7 @@
                 <w:sz w:val="19"/>
                 <w:szCs w:val="19"/>
               </w:rPr>
-              <w:t xml:space="preserve">15 September 2026</w:t>
+              <w:t xml:space="preserve">16 September 2026</w:t>
             </w:r>
           </w:p>
         </w:tc>
@@ -464,7 +464,7 @@
           <w:sz w:val="21"/>
           <w:szCs w:val="21"/>
         </w:rPr>
-        <w:t xml:space="preserve">This guide has not yet been piloted in a real classroom. Read it fully before your first session, adapt the timings to your own periods, and — if possible — have a second Guidance teacher or school counsellor review it with you first. Please also read docs/syllabus-mapping.docx alongside this guide: it grounds the same four official Careers Guidance and Counselling areas — Personal, Social, Vocational, Educational (PSVE) — used throughout this document in the 2023 Zambia Education Curriculum Framework, and names one item still worth confirming with CDC (its Section 2.4).</w:t>
+        <w:t xml:space="preserve">This guide has not yet been piloted in a real classroom. Read it fully before your first session, adapt the timings to your own periods, and, if possible, have a second Guidance teacher or school counsellor review it with you first. Please also read docs/syllabus-mapping.docx alongside this guide: it grounds the same four official Careers Guidance and Counselling areas, Personal, Social, Vocational, Educational (PSVE), used throughout this document in the 2023 Zambia Education Curriculum Framework, and names one item still worth confirming with CDC (its Section 2.4).</w:t>
       </w:r>
     </w:p>
     <w:p>
@@ -484,7 +484,7 @@
           <w:sz w:val="30"/>
           <w:szCs w:val="30"/>
         </w:rPr>
-        <w:t xml:space="preserve">2. What This Tool Is — and Is Not</w:t>
+        <w:t xml:space="preserve">2. What This Tool Is, and Is Not</w:t>
       </w:r>
     </w:p>
     <w:tbl>
@@ -1538,7 +1538,7 @@
           <w:sz w:val="30"/>
           <w:szCs w:val="30"/>
         </w:rPr>
-        <w:t xml:space="preserve">6. Session 1 — Introduction &amp; Self-Assessment</w:t>
+        <w:t xml:space="preserve">6. Session 1: Introduction &amp; Self-Assessment</w:t>
       </w:r>
     </w:p>
     <w:p>
@@ -1612,7 +1612,7 @@
           <w:sz w:val="21"/>
           <w:szCs w:val="21"/>
         </w:rPr>
-        <w:t xml:space="preserve">Hand out workbooks (or arrange shared use — see Section 9) and read the instructions and 1–5 scale together as a class.</w:t>
+        <w:t xml:space="preserve">Hand out workbooks (or arrange shared use; see Section 9) and read the instructions and 1–5 scale together as a class.</w:t>
       </w:r>
     </w:p>
     <w:p>
@@ -1631,7 +1631,7 @@
           <w:sz w:val="21"/>
           <w:szCs w:val="21"/>
         </w:rPr>
-        <w:t xml:space="preserve">Let learners work through all 42 questions individually and silently. Circulate to answer procedural questions only (e.g. “what does this word mean”) — do not help them decide how to answer.</w:t>
+        <w:t xml:space="preserve">Let learners work through all 42 questions individually and silently. Circulate to answer procedural questions only (e.g. “what does this word mean”); do not help them decide how to answer.</w:t>
       </w:r>
     </w:p>
     <w:p>
@@ -1670,7 +1670,7 @@
           <w:sz w:val="30"/>
           <w:szCs w:val="30"/>
         </w:rPr>
-        <w:t xml:space="preserve">7. Session 2 — Scoring &amp; Reading Your Result</w:t>
+        <w:t xml:space="preserve">7. Session 2: Scoring &amp; Reading Your Result</w:t>
       </w:r>
     </w:p>
     <w:p>
@@ -1807,7 +1807,7 @@
           <w:sz w:val="30"/>
           <w:szCs w:val="30"/>
         </w:rPr>
-        <w:t xml:space="preserve">8. Session 3 — World of Work, Decisions, Pathways &amp; Working Together</w:t>
+        <w:t xml:space="preserve">8. Session 3: World of Work, Decisions, Pathways &amp; Working Together</w:t>
       </w:r>
     </w:p>
     <w:p>
@@ -1877,7 +1877,7 @@
           <w:sz w:val="21"/>
           <w:szCs w:val="21"/>
         </w:rPr>
-        <w:t xml:space="preserve">Read or paraphrase the note for each orientation represented in your class. Keep it honest — including the less glamorous parts named below is deliberate.</w:t>
+        <w:t xml:space="preserve">Read or paraphrase the note for each orientation represented in your class. Keep it honest: including the less glamorous parts named below is deliberate.</w:t>
       </w:r>
     </w:p>
     <w:tbl>
@@ -1990,7 +1990,7 @@
                 <w:sz w:val="19"/>
                 <w:szCs w:val="19"/>
               </w:rPr>
-              <w:t xml:space="preserve">Order Orientation — The Builder</w:t>
+              <w:t xml:space="preserve">Order Orientation: The Builder</w:t>
             </w:r>
           </w:p>
         </w:tc>
@@ -2020,7 +2020,7 @@
                 <w:sz w:val="19"/>
                 <w:szCs w:val="19"/>
               </w:rPr>
-              <w:t xml:space="preserve">People with strong Order often end up in work where a small mistake matters a lot — a wrong measurement on a building, an error in an accounts book. Much of the day is quiet and methodical: checking, planning, and following procedures precisely, sometimes for months before a project is finished.</w:t>
+              <w:t xml:space="preserve">People with strong Order often end up in work where a small mistake matters a lot: a wrong measurement on a building, an error in an accounts book. Much of the day is quiet and methodical: checking, planning, and following procedures precisely, sometimes for months before a project is finished.</w:t>
             </w:r>
           </w:p>
         </w:tc>
@@ -2053,7 +2053,7 @@
                 <w:sz w:val="19"/>
                 <w:szCs w:val="19"/>
               </w:rPr>
-              <w:t xml:space="preserve">Form Orientation — The Creator</w:t>
+              <w:t xml:space="preserve">Form Orientation: The Creator</w:t>
             </w:r>
           </w:p>
         </w:tc>
@@ -2084,7 +2084,7 @@
                 <w:sz w:val="19"/>
                 <w:szCs w:val="19"/>
               </w:rPr>
-              <w:t xml:space="preserve">Creative work often means long stretches with no fixed instructions — you decide what “good” looks like yourself. Income can be irregular, especially early on, and most people in creative fields also do other paid work alongside their craft.</w:t>
+              <w:t xml:space="preserve">Creative work often means long stretches with no fixed instructions: you decide what “good” looks like yourself. Income can be irregular, especially early on, and most people in creative fields also do other paid work alongside their craft.</w:t>
             </w:r>
           </w:p>
         </w:tc>
@@ -2116,7 +2116,7 @@
                 <w:sz w:val="19"/>
                 <w:szCs w:val="19"/>
               </w:rPr>
-              <w:t xml:space="preserve">Coordination Orientation — The Orchestrator</w:t>
+              <w:t xml:space="preserve">Coordination Orientation: The Orchestrator</w:t>
             </w:r>
           </w:p>
         </w:tc>
@@ -2146,7 +2146,7 @@
                 <w:sz w:val="19"/>
                 <w:szCs w:val="19"/>
               </w:rPr>
-              <w:t xml:space="preserve">This work is mostly about people, not tasks — meetings, phone calls, and sorting out clashes between what different people want. It can be tiring because your day depends on everyone else's day going to plan, which it often does not.</w:t>
+              <w:t xml:space="preserve">This work is mostly about people, not tasks: meetings, phone calls, and sorting out clashes between what different people want. It can be tiring because your day depends on everyone else's day going to plan, which it often does not.</w:t>
             </w:r>
           </w:p>
         </w:tc>
@@ -2179,7 +2179,7 @@
                 <w:sz w:val="19"/>
                 <w:szCs w:val="19"/>
               </w:rPr>
-              <w:t xml:space="preserve">Discovery Orientation — The Explorer</w:t>
+              <w:t xml:space="preserve">Discovery Orientation: The Explorer</w:t>
             </w:r>
           </w:p>
         </w:tc>
@@ -2242,7 +2242,7 @@
                 <w:sz w:val="19"/>
                 <w:szCs w:val="19"/>
               </w:rPr>
-              <w:t xml:space="preserve">Integration Orientation — The Guide</w:t>
+              <w:t xml:space="preserve">Integration Orientation: The Guide</w:t>
             </w:r>
           </w:p>
         </w:tc>
@@ -2272,7 +2272,7 @@
                 <w:sz w:val="19"/>
                 <w:szCs w:val="19"/>
               </w:rPr>
-              <w:t xml:space="preserve">Teaching, counselling and mentoring work is emotionally demanding as well as practically demanding — you carry other people's setbacks alongside your own. It is also often paid less than its importance deserves, which is worth naming honestly.</w:t>
+              <w:t xml:space="preserve">Teaching, counselling and mentoring work is emotionally demanding as well as practically demanding; you carry other people's setbacks alongside your own. It is also often paid less than its importance deserves, which is worth naming honestly.</w:t>
             </w:r>
           </w:p>
         </w:tc>
@@ -2305,7 +2305,7 @@
                 <w:sz w:val="19"/>
                 <w:szCs w:val="19"/>
               </w:rPr>
-              <w:t xml:space="preserve">Preservation Orientation — The Guardian</w:t>
+              <w:t xml:space="preserve">Preservation Orientation: The Guardian</w:t>
             </w:r>
           </w:p>
         </w:tc>
@@ -2368,7 +2368,7 @@
                 <w:sz w:val="19"/>
                 <w:szCs w:val="19"/>
               </w:rPr>
-              <w:t xml:space="preserve">Transformation Orientation — The Transmuter</w:t>
+              <w:t xml:space="preserve">Transformation Orientation: The Transmuter</w:t>
             </w:r>
           </w:p>
         </w:tc>
@@ -2398,7 +2398,7 @@
                 <w:sz w:val="19"/>
                 <w:szCs w:val="19"/>
               </w:rPr>
-              <w:t xml:space="preserve">Change-focused work is unstable by nature — you may need to start over more than once, and not every idea or business will succeed. Financial security often comes later than in more traditional careers, if it comes from this path at all.</w:t>
+              <w:t xml:space="preserve">Change-focused work is unstable by nature: you may need to start over more than once, and not every idea or business will succeed. Financial security often comes later than in more traditional careers, if it comes from this path at all.</w:t>
             </w:r>
           </w:p>
         </w:tc>
@@ -2566,7 +2566,7 @@
           <w:sz w:val="21"/>
           <w:szCs w:val="21"/>
         </w:rPr>
-        <w:t xml:space="preserve">In small groups (mixed dominant orientations work best), let learners share one item each from their own Pathways to Explore section — a subject, institution, or career example — and why it appealed to them.</w:t>
+        <w:t xml:space="preserve">In small groups (mixed dominant orientations work best), let learners share one item each from their own Pathways to Explore section (a subject, institution, or career example) and why it appealed to them.</w:t>
       </w:r>
     </w:p>
     <w:p>
@@ -2698,7 +2698,7 @@
           <w:sz w:val="21"/>
           <w:szCs w:val="21"/>
         </w:rPr>
-        <w:t xml:space="preserve">No computers or internet are needed at any point — the workbook and this guide are both designed to work entirely on paper.</w:t>
+        <w:t xml:space="preserve">No computers or internet are needed at any point: the workbook and this guide are both designed to work entirely on paper.</w:t>
       </w:r>
     </w:p>
     <w:p>
@@ -2861,7 +2861,7 @@
                 <w:sz w:val="19"/>
                 <w:szCs w:val="19"/>
               </w:rPr>
-              <w:t xml:space="preserve">Do not treat the workbook as overriding family input. Acknowledge both: “Your result is one useful piece of information about yourself — it sits alongside what your family wants for you and what the school advises, not above them.” Offer to help the student prepare for that conversation at home rather than have it for them.</w:t>
+              <w:t xml:space="preserve">Do not treat the workbook as overriding family input. Acknowledge both: “Your result is one useful piece of information about yourself; it sits alongside what your family wants for you and what the school advises, not above them.” Offer to help the student prepare for that conversation at home rather than have it for them.</w:t>
             </w:r>
           </w:p>
         </w:tc>
@@ -3250,7 +3250,7 @@
           <w:sz w:val="30"/>
           <w:szCs w:val="30"/>
         </w:rPr>
-        <w:t xml:space="preserve">12. Quick Reference — The Seven Orientations</w:t>
+        <w:t xml:space="preserve">12. Quick Reference: The Seven Orientations</w:t>
       </w:r>
     </w:p>
     <w:p>
@@ -4075,7 +4075,7 @@
           <w:sz w:val="21"/>
           <w:szCs w:val="21"/>
         </w:rPr>
-        <w:t xml:space="preserve">Use this only to track who has completed the activity — never record a learner's Dominant/Secondary/Shadow result here or in any register your school cannot keep confidential. Personal results belong to the learner.</w:t>
+        <w:t xml:space="preserve">Use this only to track who has completed the activity; never record a learner's Dominant/Secondary/Shadow result here or in any register your school cannot keep confidential. Personal results belong to the learner.</w:t>
       </w:r>
     </w:p>
     <w:tbl>
@@ -5116,7 +5116,7 @@
         <w:sz w:val="16"/>
         <w:szCs w:val="16"/>
       </w:rPr>
-      <w:t xml:space="preserve">Pathway Orientation — Facilitator's Guide (DRAFT)</w:t>
+      <w:t xml:space="preserve">Pathway Orientation: Facilitator's Guide (DRAFT)</w:t>
     </w:r>
   </w:p>
 </w:hdr>

</xml_diff>